<commit_message>
feat: deliver dynamic Trend2SKU workbench with Qwen
</commit_message>
<xml_diff>
--- a/deliverables/名创优品_开题报告补充材料_v1.docx
+++ b/deliverables/名创优品_开题报告补充材料_v1.docx
@@ -88,6 +88,57 @@
           <w:b w:val="0"/>
           <w:sz w:val="20"/>
         </w:rPr>
+        <w:t>队伍名称：Saber</w:t>
+      </w:r>
+    </w:p>
+    <w:p>
+      <w:pPr>
+        <w:numPr>
+          <w:ilvl w:val="0"/>
+          <w:numId w:val="10"/>
+        </w:numPr>
+        <w:pStyle w:val="ListBullet"/>
+      </w:pPr>
+      <w:r>
+        <w:rPr>
+          <w:rFonts w:ascii="PingFang SC" w:hAnsi="PingFang SC" w:eastAsia="PingFang SC" w:cs="PingFang SC"/>
+          <w:b w:val="0"/>
+          <w:sz w:val="20"/>
+        </w:rPr>
+        <w:t>成员人数：1 人</w:t>
+      </w:r>
+    </w:p>
+    <w:p>
+      <w:pPr>
+        <w:numPr>
+          <w:ilvl w:val="0"/>
+          <w:numId w:val="10"/>
+        </w:numPr>
+        <w:pStyle w:val="ListBullet"/>
+      </w:pPr>
+      <w:r>
+        <w:rPr>
+          <w:rFonts w:ascii="PingFang SC" w:hAnsi="PingFang SC" w:eastAsia="PingFang SC" w:cs="PingFang SC"/>
+          <w:b w:val="0"/>
+          <w:sz w:val="20"/>
+        </w:rPr>
+        <w:t>获知渠道：小红书</w:t>
+      </w:r>
+    </w:p>
+    <w:p>
+      <w:pPr>
+        <w:numPr>
+          <w:ilvl w:val="0"/>
+          <w:numId w:val="10"/>
+        </w:numPr>
+        <w:pStyle w:val="ListBullet"/>
+      </w:pPr>
+      <w:r>
+        <w:rPr>
+          <w:rFonts w:ascii="PingFang SC" w:hAnsi="PingFang SC" w:eastAsia="PingFang SC" w:cs="PingFang SC"/>
+          <w:b w:val="0"/>
+          <w:sz w:val="20"/>
+        </w:rPr>
         <w:t>核心链路：趋势感知 → 产品创意 → 上市验证</w:t>
       </w:r>
     </w:p>
@@ -105,7 +156,7 @@
           <w:b w:val="0"/>
           <w:sz w:val="20"/>
         </w:rPr>
-        <w:t>内容版本：v1，2026-07-19</w:t>
+        <w:t>内容版本：v2，2026-07-19</w:t>
       </w:r>
     </w:p>
     <w:p>
@@ -6220,7 +6271,7 @@
           <w:b w:val="0"/>
           <w:sz w:val="20"/>
         </w:rPr>
-        <w:t xml:space="preserve"> 仅建议进入人工复核和下一验证阶段代码资产公开分发前仍须完成权属与许可证核验。</w:t>
+        <w:t xml:space="preserve"> 仅建议进入人工复核和下一验证阶段。参赛信息为队伍名称：Saber、成员人数：1 人、获知渠道：小红书；隐私授权仍须由参赛者本人在平台完成。代码资产公开分发前仍须完成权属与许可证核验。</w:t>
       </w:r>
     </w:p>
     <w:sectPr>

</xml_diff>